<commit_message>
feat(documents): logo OpenNAT sur la fiche de synthèse et le guide utilisateur
Fiche : logo au-dessus du titre ; titres enfin en Poppins (la police du thème l'emportait).
Guide : option --logo de methode_docx.py, logo centré ; plafond des largeurs de colonnes relevé (7 à 10)
pour que les tableaux à texte long ne s'étirent pas en hauteur (guide revenu à 6 pages).
</commit_message>
<xml_diff>
--- a/livraison/OpenNAT, guide utilisateur.docx
+++ b/livraison/OpenNAT, guide utilisateur.docx
@@ -4,8 +4,49 @@
   <w:body>
     <w:p>
       <w:pPr>
+        <w:keepNext/>
+        <w:spacing w:before="0" w:after="113"/>
+        <w:jc w:val="center"/>
+      </w:pPr>
+      <w:r>
+        <w:drawing>
+          <wp:inline xmlns:a="http://schemas.openxmlformats.org/drawingml/2006/main" xmlns:pic="http://schemas.openxmlformats.org/drawingml/2006/picture">
+            <wp:extent cx="1800000" cy="407571"/>
+            <wp:docPr id="1" name="Picture 1"/>
+            <wp:cNvGraphicFramePr>
+              <a:graphicFrameLocks noChangeAspect="1"/>
+            </wp:cNvGraphicFramePr>
+            <a:graphic>
+              <a:graphicData uri="http://schemas.openxmlformats.org/drawingml/2006/picture">
+                <pic:pic>
+                  <pic:nvPicPr>
+                    <pic:cNvPr id="0" name="opennat_logo.png"/>
+                    <pic:cNvPicPr/>
+                  </pic:nvPicPr>
+                  <pic:blipFill>
+                    <a:blip r:embed="rId13"/>
+                    <a:stretch>
+                      <a:fillRect/>
+                    </a:stretch>
+                  </pic:blipFill>
+                  <pic:spPr>
+                    <a:xfrm>
+                      <a:off x="0" y="0"/>
+                      <a:ext cx="1800000" cy="407571"/>
+                    </a:xfrm>
+                    <a:prstGeom prst="rect"/>
+                  </pic:spPr>
+                </pic:pic>
+              </a:graphicData>
+            </a:graphic>
+          </wp:inline>
+        </w:drawing>
+      </w:r>
+    </w:p>
+    <w:p>
+      <w:pPr>
         <w:pStyle w:val="Title"/>
-        <w:spacing w:before="227" w:after="340"/>
+        <w:spacing w:before="113" w:after="340"/>
       </w:pPr>
       <w:r>
         <w:rPr>
@@ -82,9 +123,9 @@
         <w:tblLayout w:type="fixed"/>
       </w:tblPr>
       <w:tblGrid>
-        <w:gridCol w:w="2379"/>
-        <w:gridCol w:w="5267"/>
-        <w:gridCol w:w="1990"/>
+        <w:gridCol w:w="1927"/>
+        <w:gridCol w:w="6096"/>
+        <w:gridCol w:w="1613"/>
       </w:tblGrid>
       <w:tr>
         <w:trPr>
@@ -93,7 +134,7 @@
         </w:trPr>
         <w:tc>
           <w:tcPr>
-            <w:tcW w:type="dxa" w:w="2380"/>
+            <w:tcW w:type="dxa" w:w="1928"/>
             <w:vAlign w:val="center"/>
             <w:shd w:val="clear" w:color="auto" w:fill="0C3342"/>
           </w:tcPr>
@@ -115,7 +156,7 @@
         </w:tc>
         <w:tc>
           <w:tcPr>
-            <w:tcW w:type="dxa" w:w="5267"/>
+            <w:tcW w:type="dxa" w:w="6097"/>
             <w:vAlign w:val="center"/>
             <w:shd w:val="clear" w:color="auto" w:fill="0C3342"/>
           </w:tcPr>
@@ -137,7 +178,7 @@
         </w:tc>
         <w:tc>
           <w:tcPr>
-            <w:tcW w:type="dxa" w:w="1991"/>
+            <w:tcW w:type="dxa" w:w="1613"/>
             <w:vAlign w:val="center"/>
             <w:shd w:val="clear" w:color="auto" w:fill="0C3342"/>
           </w:tcPr>
@@ -164,7 +205,7 @@
         </w:trPr>
         <w:tc>
           <w:tcPr>
-            <w:tcW w:type="dxa" w:w="2380"/>
+            <w:tcW w:type="dxa" w:w="1928"/>
             <w:vAlign w:val="center"/>
           </w:tcPr>
           <w:p>
@@ -183,7 +224,7 @@
         </w:tc>
         <w:tc>
           <w:tcPr>
-            <w:tcW w:type="dxa" w:w="5267"/>
+            <w:tcW w:type="dxa" w:w="6097"/>
             <w:vAlign w:val="center"/>
           </w:tcPr>
           <w:p>
@@ -202,7 +243,7 @@
         </w:tc>
         <w:tc>
           <w:tcPr>
-            <w:tcW w:type="dxa" w:w="1991"/>
+            <w:tcW w:type="dxa" w:w="1613"/>
             <w:vAlign w:val="center"/>
           </w:tcPr>
           <w:p>
@@ -226,7 +267,7 @@
         </w:trPr>
         <w:tc>
           <w:tcPr>
-            <w:tcW w:type="dxa" w:w="2380"/>
+            <w:tcW w:type="dxa" w:w="1928"/>
             <w:vAlign w:val="center"/>
           </w:tcPr>
           <w:p>
@@ -245,7 +286,7 @@
         </w:tc>
         <w:tc>
           <w:tcPr>
-            <w:tcW w:type="dxa" w:w="5267"/>
+            <w:tcW w:type="dxa" w:w="6097"/>
             <w:vAlign w:val="center"/>
           </w:tcPr>
           <w:p>
@@ -264,7 +305,7 @@
         </w:tc>
         <w:tc>
           <w:tcPr>
-            <w:tcW w:type="dxa" w:w="1991"/>
+            <w:tcW w:type="dxa" w:w="1613"/>
             <w:vAlign w:val="center"/>
           </w:tcPr>
           <w:p>
@@ -288,7 +329,7 @@
         </w:trPr>
         <w:tc>
           <w:tcPr>
-            <w:tcW w:type="dxa" w:w="2380"/>
+            <w:tcW w:type="dxa" w:w="1928"/>
             <w:vAlign w:val="center"/>
           </w:tcPr>
           <w:p>
@@ -307,7 +348,7 @@
         </w:tc>
         <w:tc>
           <w:tcPr>
-            <w:tcW w:type="dxa" w:w="5267"/>
+            <w:tcW w:type="dxa" w:w="6097"/>
             <w:vAlign w:val="center"/>
           </w:tcPr>
           <w:p>
@@ -326,7 +367,7 @@
         </w:tc>
         <w:tc>
           <w:tcPr>
-            <w:tcW w:type="dxa" w:w="1991"/>
+            <w:tcW w:type="dxa" w:w="1613"/>
             <w:vAlign w:val="center"/>
           </w:tcPr>
           <w:p>
@@ -350,7 +391,7 @@
         </w:trPr>
         <w:tc>
           <w:tcPr>
-            <w:tcW w:type="dxa" w:w="2380"/>
+            <w:tcW w:type="dxa" w:w="1928"/>
             <w:vAlign w:val="center"/>
           </w:tcPr>
           <w:p>
@@ -369,7 +410,7 @@
         </w:tc>
         <w:tc>
           <w:tcPr>
-            <w:tcW w:type="dxa" w:w="5267"/>
+            <w:tcW w:type="dxa" w:w="6097"/>
             <w:vAlign w:val="center"/>
           </w:tcPr>
           <w:p>
@@ -388,7 +429,7 @@
         </w:tc>
         <w:tc>
           <w:tcPr>
-            <w:tcW w:type="dxa" w:w="1991"/>
+            <w:tcW w:type="dxa" w:w="1613"/>
             <w:vAlign w:val="center"/>
           </w:tcPr>
           <w:p>
@@ -412,7 +453,7 @@
         </w:trPr>
         <w:tc>
           <w:tcPr>
-            <w:tcW w:type="dxa" w:w="2380"/>
+            <w:tcW w:type="dxa" w:w="1928"/>
             <w:vAlign w:val="center"/>
           </w:tcPr>
           <w:p>
@@ -430,7 +471,7 @@
         </w:tc>
         <w:tc>
           <w:tcPr>
-            <w:tcW w:type="dxa" w:w="5267"/>
+            <w:tcW w:type="dxa" w:w="6097"/>
             <w:vAlign w:val="center"/>
           </w:tcPr>
           <w:p>
@@ -448,7 +489,7 @@
         </w:tc>
         <w:tc>
           <w:tcPr>
-            <w:tcW w:type="dxa" w:w="1991"/>
+            <w:tcW w:type="dxa" w:w="1613"/>
             <w:vAlign w:val="center"/>
           </w:tcPr>
           <w:p>
@@ -576,9 +617,9 @@
         <w:tblLayout w:type="fixed"/>
       </w:tblPr>
       <w:tblGrid>
-        <w:gridCol w:w="3609"/>
-        <w:gridCol w:w="3609"/>
-        <w:gridCol w:w="2418"/>
+        <w:gridCol w:w="4386"/>
+        <w:gridCol w:w="3193"/>
+        <w:gridCol w:w="2057"/>
       </w:tblGrid>
       <w:tr>
         <w:trPr>
@@ -587,7 +628,7 @@
         </w:trPr>
         <w:tc>
           <w:tcPr>
-            <w:tcW w:type="dxa" w:w="3610"/>
+            <w:tcW w:type="dxa" w:w="4387"/>
             <w:vAlign w:val="center"/>
             <w:shd w:val="clear" w:color="auto" w:fill="0C3342"/>
           </w:tcPr>
@@ -609,7 +650,7 @@
         </w:tc>
         <w:tc>
           <w:tcPr>
-            <w:tcW w:type="dxa" w:w="3610"/>
+            <w:tcW w:type="dxa" w:w="3194"/>
             <w:vAlign w:val="center"/>
             <w:shd w:val="clear" w:color="auto" w:fill="0C3342"/>
           </w:tcPr>
@@ -631,7 +672,7 @@
         </w:tc>
         <w:tc>
           <w:tcPr>
-            <w:tcW w:type="dxa" w:w="2419"/>
+            <w:tcW w:type="dxa" w:w="2058"/>
             <w:vAlign w:val="center"/>
             <w:shd w:val="clear" w:color="auto" w:fill="0C3342"/>
           </w:tcPr>
@@ -658,7 +699,7 @@
         </w:trPr>
         <w:tc>
           <w:tcPr>
-            <w:tcW w:type="dxa" w:w="3610"/>
+            <w:tcW w:type="dxa" w:w="4387"/>
             <w:vAlign w:val="center"/>
           </w:tcPr>
           <w:p>
@@ -677,7 +718,7 @@
         </w:tc>
         <w:tc>
           <w:tcPr>
-            <w:tcW w:type="dxa" w:w="3610"/>
+            <w:tcW w:type="dxa" w:w="3194"/>
             <w:vAlign w:val="center"/>
           </w:tcPr>
           <w:p>
@@ -696,7 +737,7 @@
         </w:tc>
         <w:tc>
           <w:tcPr>
-            <w:tcW w:type="dxa" w:w="2419"/>
+            <w:tcW w:type="dxa" w:w="2058"/>
             <w:vAlign w:val="center"/>
           </w:tcPr>
           <w:p>
@@ -720,7 +761,7 @@
         </w:trPr>
         <w:tc>
           <w:tcPr>
-            <w:tcW w:type="dxa" w:w="3610"/>
+            <w:tcW w:type="dxa" w:w="4387"/>
             <w:vAlign w:val="center"/>
           </w:tcPr>
           <w:p>
@@ -739,7 +780,7 @@
         </w:tc>
         <w:tc>
           <w:tcPr>
-            <w:tcW w:type="dxa" w:w="3610"/>
+            <w:tcW w:type="dxa" w:w="3194"/>
             <w:vAlign w:val="center"/>
           </w:tcPr>
           <w:p>
@@ -758,7 +799,7 @@
         </w:tc>
         <w:tc>
           <w:tcPr>
-            <w:tcW w:type="dxa" w:w="2419"/>
+            <w:tcW w:type="dxa" w:w="2058"/>
             <w:vAlign w:val="center"/>
           </w:tcPr>
           <w:p>
@@ -782,7 +823,7 @@
         </w:trPr>
         <w:tc>
           <w:tcPr>
-            <w:tcW w:type="dxa" w:w="3610"/>
+            <w:tcW w:type="dxa" w:w="4387"/>
             <w:vAlign w:val="center"/>
           </w:tcPr>
           <w:p>
@@ -801,7 +842,7 @@
         </w:tc>
         <w:tc>
           <w:tcPr>
-            <w:tcW w:type="dxa" w:w="3610"/>
+            <w:tcW w:type="dxa" w:w="3194"/>
             <w:vAlign w:val="center"/>
           </w:tcPr>
           <w:p>
@@ -820,7 +861,7 @@
         </w:tc>
         <w:tc>
           <w:tcPr>
-            <w:tcW w:type="dxa" w:w="2419"/>
+            <w:tcW w:type="dxa" w:w="2058"/>
             <w:vAlign w:val="center"/>
           </w:tcPr>
           <w:p>
@@ -844,7 +885,7 @@
         </w:trPr>
         <w:tc>
           <w:tcPr>
-            <w:tcW w:type="dxa" w:w="3610"/>
+            <w:tcW w:type="dxa" w:w="4387"/>
             <w:vAlign w:val="center"/>
           </w:tcPr>
           <w:p>
@@ -863,7 +904,7 @@
         </w:tc>
         <w:tc>
           <w:tcPr>
-            <w:tcW w:type="dxa" w:w="3610"/>
+            <w:tcW w:type="dxa" w:w="3194"/>
             <w:vAlign w:val="center"/>
           </w:tcPr>
           <w:p>
@@ -882,7 +923,7 @@
         </w:tc>
         <w:tc>
           <w:tcPr>
-            <w:tcW w:type="dxa" w:w="2419"/>
+            <w:tcW w:type="dxa" w:w="2058"/>
             <w:vAlign w:val="center"/>
           </w:tcPr>
           <w:p>
@@ -906,7 +947,7 @@
         </w:trPr>
         <w:tc>
           <w:tcPr>
-            <w:tcW w:type="dxa" w:w="3610"/>
+            <w:tcW w:type="dxa" w:w="4387"/>
             <w:vAlign w:val="center"/>
           </w:tcPr>
           <w:p>
@@ -925,7 +966,7 @@
         </w:tc>
         <w:tc>
           <w:tcPr>
-            <w:tcW w:type="dxa" w:w="3610"/>
+            <w:tcW w:type="dxa" w:w="3194"/>
             <w:vAlign w:val="center"/>
           </w:tcPr>
           <w:p>
@@ -944,7 +985,7 @@
         </w:tc>
         <w:tc>
           <w:tcPr>
-            <w:tcW w:type="dxa" w:w="2419"/>
+            <w:tcW w:type="dxa" w:w="2058"/>
             <w:vAlign w:val="center"/>
           </w:tcPr>
           <w:p>
@@ -968,7 +1009,7 @@
         </w:trPr>
         <w:tc>
           <w:tcPr>
-            <w:tcW w:type="dxa" w:w="3610"/>
+            <w:tcW w:type="dxa" w:w="4387"/>
             <w:vAlign w:val="center"/>
           </w:tcPr>
           <w:p>
@@ -987,7 +1028,7 @@
         </w:tc>
         <w:tc>
           <w:tcPr>
-            <w:tcW w:type="dxa" w:w="3610"/>
+            <w:tcW w:type="dxa" w:w="3194"/>
             <w:vAlign w:val="center"/>
           </w:tcPr>
           <w:p>
@@ -1006,7 +1047,7 @@
         </w:tc>
         <w:tc>
           <w:tcPr>
-            <w:tcW w:type="dxa" w:w="2419"/>
+            <w:tcW w:type="dxa" w:w="2058"/>
             <w:vAlign w:val="center"/>
           </w:tcPr>
           <w:p>
@@ -1030,7 +1071,7 @@
         </w:trPr>
         <w:tc>
           <w:tcPr>
-            <w:tcW w:type="dxa" w:w="3610"/>
+            <w:tcW w:type="dxa" w:w="4387"/>
             <w:vAlign w:val="center"/>
           </w:tcPr>
           <w:p>
@@ -1049,7 +1090,7 @@
         </w:tc>
         <w:tc>
           <w:tcPr>
-            <w:tcW w:type="dxa" w:w="3610"/>
+            <w:tcW w:type="dxa" w:w="3194"/>
             <w:vAlign w:val="center"/>
           </w:tcPr>
           <w:p>
@@ -1068,7 +1109,7 @@
         </w:tc>
         <w:tc>
           <w:tcPr>
-            <w:tcW w:type="dxa" w:w="2419"/>
+            <w:tcW w:type="dxa" w:w="2058"/>
             <w:vAlign w:val="center"/>
           </w:tcPr>
           <w:p>
@@ -1092,7 +1133,7 @@
         </w:trPr>
         <w:tc>
           <w:tcPr>
-            <w:tcW w:type="dxa" w:w="3610"/>
+            <w:tcW w:type="dxa" w:w="4387"/>
             <w:vAlign w:val="center"/>
           </w:tcPr>
           <w:p>
@@ -1111,7 +1152,7 @@
         </w:tc>
         <w:tc>
           <w:tcPr>
-            <w:tcW w:type="dxa" w:w="3610"/>
+            <w:tcW w:type="dxa" w:w="3194"/>
             <w:vAlign w:val="center"/>
           </w:tcPr>
           <w:p>
@@ -1130,7 +1171,7 @@
         </w:tc>
         <w:tc>
           <w:tcPr>
-            <w:tcW w:type="dxa" w:w="2419"/>
+            <w:tcW w:type="dxa" w:w="2058"/>
             <w:vAlign w:val="center"/>
           </w:tcPr>
           <w:p>
@@ -1154,7 +1195,7 @@
         </w:trPr>
         <w:tc>
           <w:tcPr>
-            <w:tcW w:type="dxa" w:w="3610"/>
+            <w:tcW w:type="dxa" w:w="4387"/>
             <w:vAlign w:val="center"/>
           </w:tcPr>
           <w:p>
@@ -1173,7 +1214,7 @@
         </w:tc>
         <w:tc>
           <w:tcPr>
-            <w:tcW w:type="dxa" w:w="3610"/>
+            <w:tcW w:type="dxa" w:w="3194"/>
             <w:vAlign w:val="center"/>
           </w:tcPr>
           <w:p>
@@ -1192,7 +1233,7 @@
         </w:tc>
         <w:tc>
           <w:tcPr>
-            <w:tcW w:type="dxa" w:w="2419"/>
+            <w:tcW w:type="dxa" w:w="2058"/>
             <w:vAlign w:val="center"/>
           </w:tcPr>
           <w:p>
@@ -1216,7 +1257,7 @@
         </w:trPr>
         <w:tc>
           <w:tcPr>
-            <w:tcW w:type="dxa" w:w="3610"/>
+            <w:tcW w:type="dxa" w:w="4387"/>
             <w:vAlign w:val="center"/>
           </w:tcPr>
           <w:p>
@@ -1234,7 +1275,7 @@
         </w:tc>
         <w:tc>
           <w:tcPr>
-            <w:tcW w:type="dxa" w:w="3610"/>
+            <w:tcW w:type="dxa" w:w="3194"/>
             <w:vAlign w:val="center"/>
           </w:tcPr>
           <w:p>
@@ -1252,7 +1293,7 @@
         </w:tc>
         <w:tc>
           <w:tcPr>
-            <w:tcW w:type="dxa" w:w="2419"/>
+            <w:tcW w:type="dxa" w:w="2058"/>
             <w:vAlign w:val="center"/>
           </w:tcPr>
           <w:p>
@@ -1286,6 +1327,7 @@
       <w:pPr>
         <w:pStyle w:val="Heading1"/>
         <w:keepNext/>
+        <w:pageBreakBefore/>
         <w:spacing w:before="397" w:after="170"/>
       </w:pPr>
       <w:r>
@@ -2075,8 +2117,8 @@
         <w:tblLayout w:type="fixed"/>
       </w:tblPr>
       <w:tblGrid>
-        <w:gridCol w:w="4843"/>
-        <w:gridCol w:w="4794"/>
+        <w:gridCol w:w="4960"/>
+        <w:gridCol w:w="4677"/>
       </w:tblGrid>
       <w:tr>
         <w:trPr>
@@ -2085,7 +2127,7 @@
         </w:trPr>
         <w:tc>
           <w:tcPr>
-            <w:tcW w:type="dxa" w:w="4844"/>
+            <w:tcW w:type="dxa" w:w="4961"/>
             <w:vAlign w:val="center"/>
             <w:shd w:val="clear" w:color="auto" w:fill="0C3342"/>
           </w:tcPr>
@@ -2107,7 +2149,7 @@
         </w:tc>
         <w:tc>
           <w:tcPr>
-            <w:tcW w:type="dxa" w:w="4794"/>
+            <w:tcW w:type="dxa" w:w="4677"/>
             <w:vAlign w:val="center"/>
             <w:shd w:val="clear" w:color="auto" w:fill="0C3342"/>
           </w:tcPr>
@@ -2134,7 +2176,7 @@
         </w:trPr>
         <w:tc>
           <w:tcPr>
-            <w:tcW w:type="dxa" w:w="4844"/>
+            <w:tcW w:type="dxa" w:w="4961"/>
             <w:vAlign w:val="center"/>
           </w:tcPr>
           <w:p>
@@ -2153,7 +2195,7 @@
         </w:tc>
         <w:tc>
           <w:tcPr>
-            <w:tcW w:type="dxa" w:w="4794"/>
+            <w:tcW w:type="dxa" w:w="4677"/>
             <w:vAlign w:val="center"/>
           </w:tcPr>
           <w:p>
@@ -2177,7 +2219,7 @@
         </w:trPr>
         <w:tc>
           <w:tcPr>
-            <w:tcW w:type="dxa" w:w="4844"/>
+            <w:tcW w:type="dxa" w:w="4961"/>
             <w:vAlign w:val="center"/>
           </w:tcPr>
           <w:p>
@@ -2210,7 +2252,7 @@
         </w:tc>
         <w:tc>
           <w:tcPr>
-            <w:tcW w:type="dxa" w:w="4794"/>
+            <w:tcW w:type="dxa" w:w="4677"/>
             <w:vAlign w:val="center"/>
           </w:tcPr>
           <w:p>
@@ -2234,7 +2276,7 @@
         </w:trPr>
         <w:tc>
           <w:tcPr>
-            <w:tcW w:type="dxa" w:w="4844"/>
+            <w:tcW w:type="dxa" w:w="4961"/>
             <w:vAlign w:val="center"/>
           </w:tcPr>
           <w:p>
@@ -2253,7 +2295,7 @@
         </w:tc>
         <w:tc>
           <w:tcPr>
-            <w:tcW w:type="dxa" w:w="4794"/>
+            <w:tcW w:type="dxa" w:w="4677"/>
             <w:vAlign w:val="center"/>
           </w:tcPr>
           <w:p>
@@ -2277,7 +2319,7 @@
         </w:trPr>
         <w:tc>
           <w:tcPr>
-            <w:tcW w:type="dxa" w:w="4844"/>
+            <w:tcW w:type="dxa" w:w="4961"/>
             <w:vAlign w:val="center"/>
           </w:tcPr>
           <w:p>
@@ -2310,7 +2352,7 @@
         </w:tc>
         <w:tc>
           <w:tcPr>
-            <w:tcW w:type="dxa" w:w="4794"/>
+            <w:tcW w:type="dxa" w:w="4677"/>
             <w:vAlign w:val="center"/>
           </w:tcPr>
           <w:p>
@@ -2334,7 +2376,7 @@
         </w:trPr>
         <w:tc>
           <w:tcPr>
-            <w:tcW w:type="dxa" w:w="4844"/>
+            <w:tcW w:type="dxa" w:w="4961"/>
             <w:vAlign w:val="center"/>
           </w:tcPr>
           <w:p>
@@ -2353,7 +2395,7 @@
         </w:tc>
         <w:tc>
           <w:tcPr>
-            <w:tcW w:type="dxa" w:w="4794"/>
+            <w:tcW w:type="dxa" w:w="4677"/>
             <w:vAlign w:val="center"/>
           </w:tcPr>
           <w:p>
@@ -2377,7 +2419,7 @@
         </w:trPr>
         <w:tc>
           <w:tcPr>
-            <w:tcW w:type="dxa" w:w="4844"/>
+            <w:tcW w:type="dxa" w:w="4961"/>
             <w:vAlign w:val="center"/>
           </w:tcPr>
           <w:p>
@@ -2396,7 +2438,7 @@
         </w:tc>
         <w:tc>
           <w:tcPr>
-            <w:tcW w:type="dxa" w:w="4794"/>
+            <w:tcW w:type="dxa" w:w="4677"/>
             <w:vAlign w:val="center"/>
           </w:tcPr>
           <w:p>
@@ -2420,7 +2462,7 @@
         </w:trPr>
         <w:tc>
           <w:tcPr>
-            <w:tcW w:type="dxa" w:w="4844"/>
+            <w:tcW w:type="dxa" w:w="4961"/>
             <w:vAlign w:val="center"/>
           </w:tcPr>
           <w:p>
@@ -2452,7 +2494,7 @@
         </w:tc>
         <w:tc>
           <w:tcPr>
-            <w:tcW w:type="dxa" w:w="4794"/>
+            <w:tcW w:type="dxa" w:w="4677"/>
             <w:vAlign w:val="center"/>
           </w:tcPr>
           <w:p>

</xml_diff>